<commit_message>
Search Modes Compendium V5.0: add §6 search efficiency
New section answers the operator question "which mode is most
efficient?" with a metric-by-metric breakdown:

  * Latency on REPEAT queries     → Recall (0 tokens, ~50ms cache hit)
  * Latency on FRESH single-fact  → Live (one LLM call, bounded)
  * Tokens / correct answer       → Recall (amortizes over re-asks)
  * Completeness on enumerations  → Exhaustive Live (V5.0)
  * No-substrate baseline          → Raw / Broad (control only)

Plus §6.1 "default rule = Recall", §6.2 "when to switch off Recall",
and §6.3 latency/cost summary table covering all five modes side by
side. Subsequent sections renumbered (Decision tree → §7, Cache
namespaces → §8, MRO intent strings → §9).

Co-Authored-By: Claude Opus 4.7 <noreply@anthropic.com>
</commit_message>
<xml_diff>
--- a/public/docs/Search_Modes_Compendium_V50.docx
+++ b/public/docs/Search_Modes_Compendium_V50.docx
@@ -429,7 +429,7 @@
                 <w:sz w:val="22"/>
                 <w:szCs w:val="22"/>
               </w:rPr>
-              <w:t xml:space="preserve">Live’s phases 1–3 followed by chunked map-reduce: every matched AIO is classified by a per-chunk LLM with strict JSON output, then merged in-Python. Guarantees full coverage.</w:t>
+              <w:t xml:space="preserve">Live's phases 1–3 followed by chunked map-reduce: every matched AIO is classified by a per-chunk LLM with strict JSON output, then merged in-Python. Guarantees full coverage.</w:t>
             </w:r>
           </w:p>
         </w:tc>
@@ -461,7 +461,7 @@
                 <w:sz w:val="22"/>
                 <w:szCs w:val="22"/>
               </w:rPr>
-              <w:t xml:space="preserve">Enumeration queries (“list all”, “how many”). When V4.6 Live returned a suspiciously short list.</w:t>
+              <w:t xml:space="preserve">Enumeration queries ("list all", "how many"). When V4.6 Live returned a suspiciously short list.</w:t>
             </w:r>
           </w:p>
         </w:tc>
@@ -796,7 +796,7 @@
         <w:spacing w:after="120"/>
       </w:pPr>
       <w:r>
-        <w:t xml:space="preserve">Two retrieval-time policies push down filters before the LLM sees the bundle: parse_filters (numeric/date predicates like “over $10M”, “after 2020”) and parse_exclusions (“not X”, “except Y”). The LLM is told to re-apply the filter in case the candidate set still includes lexical-match-but-numeric-fail rows.</w:t>
+        <w:t xml:space="preserve">Two retrieval-time policies push down filters before the LLM sees the bundle: parse_filters (numeric/date predicates like "over $10M", "after 2020") and parse_exclusions ("not X", "except Y"). The LLM is told to re-apply the filter in case the candidate set still includes lexical-match-but-numeric-fail rows.</w:t>
       </w:r>
     </w:p>
     <w:p>
@@ -871,7 +871,7 @@
         <w:spacing w:after="120"/>
       </w:pPr>
       <w:r>
-        <w:t xml:space="preserve">Demo failure: 6 Division-08 cost codes in the corpus, Live returned 4. Operator can’t tell from the response that 2 are missing.</w:t>
+        <w:t xml:space="preserve">Demo failure: 6 Division-08 cost codes in the corpus, Live returned 4. Operator can't tell from the response that 2 are missing.</w:t>
       </w:r>
     </w:p>
     <w:p>
@@ -926,9 +926,7 @@
         <w:spacing w:after="60"/>
       </w:pPr>
       <w:r>
-        <w:t xml:space="preserve">Each chunk → one Anthropic call with strict JSON schema:
-  { matches: [{aio_name, similarity, why_match}], failures: [...] }
-Validated by pydantic; one retry-once on parse failure</w:t>
+        <w:t xml:space="preserve">Each chunk → one Anthropic call with strict JSON schema: { matches: [{aio_name, similarity, why_match}], failures: [...] }. Validated by pydantic; one retry-once on parse failure</w:t>
       </w:r>
     </w:p>
     <w:p>
@@ -1326,7 +1324,7 @@
           <w:sz w:val="32"/>
           <w:szCs w:val="32"/>
         </w:rPr>
-        <w:t xml:space="preserve">6. Mode-selection decision tree</w:t>
+        <w:t xml:space="preserve">6. Search efficiency — which mode is most efficient?</w:t>
       </w:r>
     </w:p>
     <w:p>
@@ -1334,7 +1332,643 @@
         <w:spacing w:after="120"/>
       </w:pPr>
       <w:r>
-        <w:t xml:space="preserve">Start at the top; first matching question wins:</w:t>
+        <w:t xml:space="preserve">"Efficient" splits five ways across the V5.0 modes. Pick by metric:</w:t>
+      </w:r>
+    </w:p>
+    <w:tbl>
+      <w:tblPr>
+        <w:tblW w:type="dxa" w:w="9360"/>
+        <w:tblBorders>
+          <w:top w:val="single" w:color="auto" w:sz="4"/>
+          <w:left w:val="single" w:color="auto" w:sz="4"/>
+          <w:bottom w:val="single" w:color="auto" w:sz="4"/>
+          <w:right w:val="single" w:color="auto" w:sz="4"/>
+          <w:insideH w:val="single" w:color="auto" w:sz="4"/>
+          <w:insideV w:val="single" w:color="auto" w:sz="4"/>
+        </w:tblBorders>
+      </w:tblPr>
+      <w:tblGrid>
+        <w:gridCol w:w="2640"/>
+        <w:gridCol w:w="2160"/>
+        <w:gridCol w:w="4560"/>
+      </w:tblGrid>
+      <w:tr>
+        <w:tc>
+          <w:tcPr>
+            <w:tcW w:type="dxa" w:w="2640"/>
+            <w:tcBorders>
+              <w:top w:val="single" w:color="CCCCCC" w:sz="1"/>
+              <w:left w:val="single" w:color="CCCCCC" w:sz="1"/>
+              <w:bottom w:val="single" w:color="CCCCCC" w:sz="1"/>
+              <w:right w:val="single" w:color="CCCCCC" w:sz="1"/>
+            </w:tcBorders>
+            <w:shd w:fill="0F3460" w:val="clear"/>
+            <w:tcMar>
+              <w:top w:type="dxa" w:w="80"/>
+              <w:left w:type="dxa" w:w="120"/>
+              <w:bottom w:type="dxa" w:w="80"/>
+              <w:right w:type="dxa" w:w="120"/>
+            </w:tcMar>
+          </w:tcPr>
+          <w:p>
+            <w:pPr>
+              <w:jc w:val="left"/>
+            </w:pPr>
+            <w:r>
+              <w:rPr>
+                <w:rFonts w:ascii="Arial" w:cs="Arial" w:eastAsia="Arial" w:hAnsi="Arial"/>
+                <w:b/>
+                <w:bCs/>
+                <w:color w:val="FFFFFF"/>
+                <w:sz w:val="22"/>
+                <w:szCs w:val="22"/>
+              </w:rPr>
+              <w:t xml:space="preserve">Metric</w:t>
+            </w:r>
+          </w:p>
+        </w:tc>
+        <w:tc>
+          <w:tcPr>
+            <w:tcW w:type="dxa" w:w="2160"/>
+            <w:tcBorders>
+              <w:top w:val="single" w:color="CCCCCC" w:sz="1"/>
+              <w:left w:val="single" w:color="CCCCCC" w:sz="1"/>
+              <w:bottom w:val="single" w:color="CCCCCC" w:sz="1"/>
+              <w:right w:val="single" w:color="CCCCCC" w:sz="1"/>
+            </w:tcBorders>
+            <w:shd w:fill="0F3460" w:val="clear"/>
+            <w:tcMar>
+              <w:top w:type="dxa" w:w="80"/>
+              <w:left w:type="dxa" w:w="120"/>
+              <w:bottom w:type="dxa" w:w="80"/>
+              <w:right w:type="dxa" w:w="120"/>
+            </w:tcMar>
+          </w:tcPr>
+          <w:p>
+            <w:pPr>
+              <w:jc w:val="left"/>
+            </w:pPr>
+            <w:r>
+              <w:rPr>
+                <w:rFonts w:ascii="Arial" w:cs="Arial" w:eastAsia="Arial" w:hAnsi="Arial"/>
+                <w:b/>
+                <w:bCs/>
+                <w:color w:val="FFFFFF"/>
+                <w:sz w:val="22"/>
+                <w:szCs w:val="22"/>
+              </w:rPr>
+              <w:t xml:space="preserve">Best mode</w:t>
+            </w:r>
+          </w:p>
+        </w:tc>
+        <w:tc>
+          <w:tcPr>
+            <w:tcW w:type="dxa" w:w="4560"/>
+            <w:tcBorders>
+              <w:top w:val="single" w:color="CCCCCC" w:sz="1"/>
+              <w:left w:val="single" w:color="CCCCCC" w:sz="1"/>
+              <w:bottom w:val="single" w:color="CCCCCC" w:sz="1"/>
+              <w:right w:val="single" w:color="CCCCCC" w:sz="1"/>
+            </w:tcBorders>
+            <w:shd w:fill="0F3460" w:val="clear"/>
+            <w:tcMar>
+              <w:top w:type="dxa" w:w="80"/>
+              <w:left w:type="dxa" w:w="120"/>
+              <w:bottom w:type="dxa" w:w="80"/>
+              <w:right w:type="dxa" w:w="120"/>
+            </w:tcMar>
+          </w:tcPr>
+          <w:p>
+            <w:pPr>
+              <w:jc w:val="left"/>
+            </w:pPr>
+            <w:r>
+              <w:rPr>
+                <w:rFonts w:ascii="Arial" w:cs="Arial" w:eastAsia="Arial" w:hAnsi="Arial"/>
+                <w:b/>
+                <w:bCs/>
+                <w:color w:val="FFFFFF"/>
+                <w:sz w:val="22"/>
+                <w:szCs w:val="22"/>
+              </w:rPr>
+              <w:t xml:space="preserve">Why</w:t>
+            </w:r>
+          </w:p>
+        </w:tc>
+      </w:tr>
+      <w:tr>
+        <w:tc>
+          <w:tcPr>
+            <w:tcW w:type="dxa" w:w="2640"/>
+            <w:tcBorders>
+              <w:top w:val="single" w:color="CCCCCC" w:sz="1"/>
+              <w:left w:val="single" w:color="CCCCCC" w:sz="1"/>
+              <w:bottom w:val="single" w:color="CCCCCC" w:sz="1"/>
+              <w:right w:val="single" w:color="CCCCCC" w:sz="1"/>
+            </w:tcBorders>
+            <w:tcMar>
+              <w:top w:type="dxa" w:w="80"/>
+              <w:left w:type="dxa" w:w="120"/>
+              <w:bottom w:type="dxa" w:w="80"/>
+              <w:right w:type="dxa" w:w="120"/>
+            </w:tcMar>
+          </w:tcPr>
+          <w:p>
+            <w:pPr>
+              <w:jc w:val="left"/>
+            </w:pPr>
+            <w:r>
+              <w:rPr>
+                <w:rFonts w:ascii="Arial" w:cs="Arial" w:eastAsia="Arial" w:hAnsi="Arial"/>
+                <w:b w:val="false"/>
+                <w:bCs w:val="false"/>
+                <w:sz w:val="22"/>
+                <w:szCs w:val="22"/>
+              </w:rPr>
+              <w:t xml:space="preserve">Latency on REPEAT queries</w:t>
+            </w:r>
+          </w:p>
+        </w:tc>
+        <w:tc>
+          <w:tcPr>
+            <w:tcW w:type="dxa" w:w="2160"/>
+            <w:tcBorders>
+              <w:top w:val="single" w:color="CCCCCC" w:sz="1"/>
+              <w:left w:val="single" w:color="CCCCCC" w:sz="1"/>
+              <w:bottom w:val="single" w:color="CCCCCC" w:sz="1"/>
+              <w:right w:val="single" w:color="CCCCCC" w:sz="1"/>
+            </w:tcBorders>
+            <w:tcMar>
+              <w:top w:type="dxa" w:w="80"/>
+              <w:left w:type="dxa" w:w="120"/>
+              <w:bottom w:type="dxa" w:w="80"/>
+              <w:right w:type="dxa" w:w="120"/>
+            </w:tcMar>
+          </w:tcPr>
+          <w:p>
+            <w:pPr>
+              <w:jc w:val="left"/>
+            </w:pPr>
+            <w:r>
+              <w:rPr>
+                <w:rFonts w:ascii="Arial" w:cs="Arial" w:eastAsia="Arial" w:hAnsi="Arial"/>
+                <w:b w:val="false"/>
+                <w:bCs w:val="false"/>
+                <w:sz w:val="22"/>
+                <w:szCs w:val="22"/>
+              </w:rPr>
+              <w:t xml:space="preserve">Recall</w:t>
+            </w:r>
+          </w:p>
+        </w:tc>
+        <w:tc>
+          <w:tcPr>
+            <w:tcW w:type="dxa" w:w="4560"/>
+            <w:tcBorders>
+              <w:top w:val="single" w:color="CCCCCC" w:sz="1"/>
+              <w:left w:val="single" w:color="CCCCCC" w:sz="1"/>
+              <w:bottom w:val="single" w:color="CCCCCC" w:sz="1"/>
+              <w:right w:val="single" w:color="CCCCCC" w:sz="1"/>
+            </w:tcBorders>
+            <w:tcMar>
+              <w:top w:type="dxa" w:w="80"/>
+              <w:left w:type="dxa" w:w="120"/>
+              <w:bottom w:type="dxa" w:w="80"/>
+              <w:right w:type="dxa" w:w="120"/>
+            </w:tcMar>
+          </w:tcPr>
+          <w:p>
+            <w:pPr>
+              <w:jc w:val="left"/>
+            </w:pPr>
+            <w:r>
+              <w:rPr>
+                <w:rFonts w:ascii="Arial" w:cs="Arial" w:eastAsia="Arial" w:hAnsi="Arial"/>
+                <w:b w:val="false"/>
+                <w:bCs w:val="false"/>
+                <w:sz w:val="22"/>
+                <w:szCs w:val="22"/>
+              </w:rPr>
+              <w:t xml:space="preserve">MRO short-circuit at trust ≥ 0.85 returns cached answer with 0 tokens, ~50ms. No LLM call at all.</w:t>
+            </w:r>
+          </w:p>
+        </w:tc>
+      </w:tr>
+      <w:tr>
+        <w:tc>
+          <w:tcPr>
+            <w:tcW w:type="dxa" w:w="2640"/>
+            <w:tcBorders>
+              <w:top w:val="single" w:color="CCCCCC" w:sz="1"/>
+              <w:left w:val="single" w:color="CCCCCC" w:sz="1"/>
+              <w:bottom w:val="single" w:color="CCCCCC" w:sz="1"/>
+              <w:right w:val="single" w:color="CCCCCC" w:sz="1"/>
+            </w:tcBorders>
+            <w:tcMar>
+              <w:top w:type="dxa" w:w="80"/>
+              <w:left w:type="dxa" w:w="120"/>
+              <w:bottom w:type="dxa" w:w="80"/>
+              <w:right w:type="dxa" w:w="120"/>
+            </w:tcMar>
+          </w:tcPr>
+          <w:p>
+            <w:pPr>
+              <w:jc w:val="left"/>
+            </w:pPr>
+            <w:r>
+              <w:rPr>
+                <w:rFonts w:ascii="Arial" w:cs="Arial" w:eastAsia="Arial" w:hAnsi="Arial"/>
+                <w:b w:val="false"/>
+                <w:bCs w:val="false"/>
+                <w:sz w:val="22"/>
+                <w:szCs w:val="22"/>
+              </w:rPr>
+              <w:t xml:space="preserve">Latency on FRESH single-fact lookups</w:t>
+            </w:r>
+          </w:p>
+        </w:tc>
+        <w:tc>
+          <w:tcPr>
+            <w:tcW w:type="dxa" w:w="2160"/>
+            <w:tcBorders>
+              <w:top w:val="single" w:color="CCCCCC" w:sz="1"/>
+              <w:left w:val="single" w:color="CCCCCC" w:sz="1"/>
+              <w:bottom w:val="single" w:color="CCCCCC" w:sz="1"/>
+              <w:right w:val="single" w:color="CCCCCC" w:sz="1"/>
+            </w:tcBorders>
+            <w:tcMar>
+              <w:top w:type="dxa" w:w="80"/>
+              <w:left w:type="dxa" w:w="120"/>
+              <w:bottom w:type="dxa" w:w="80"/>
+              <w:right w:type="dxa" w:w="120"/>
+            </w:tcMar>
+          </w:tcPr>
+          <w:p>
+            <w:pPr>
+              <w:jc w:val="left"/>
+            </w:pPr>
+            <w:r>
+              <w:rPr>
+                <w:rFonts w:ascii="Arial" w:cs="Arial" w:eastAsia="Arial" w:hAnsi="Arial"/>
+                <w:b w:val="false"/>
+                <w:bCs w:val="false"/>
+                <w:sz w:val="22"/>
+                <w:szCs w:val="22"/>
+              </w:rPr>
+              <w:t xml:space="preserve">Live</w:t>
+            </w:r>
+          </w:p>
+        </w:tc>
+        <w:tc>
+          <w:tcPr>
+            <w:tcW w:type="dxa" w:w="4560"/>
+            <w:tcBorders>
+              <w:top w:val="single" w:color="CCCCCC" w:sz="1"/>
+              <w:left w:val="single" w:color="CCCCCC" w:sz="1"/>
+              <w:bottom w:val="single" w:color="CCCCCC" w:sz="1"/>
+              <w:right w:val="single" w:color="CCCCCC" w:sz="1"/>
+            </w:tcBorders>
+            <w:tcMar>
+              <w:top w:type="dxa" w:w="80"/>
+              <w:left w:type="dxa" w:w="120"/>
+              <w:bottom w:type="dxa" w:w="80"/>
+              <w:right w:type="dxa" w:w="120"/>
+            </w:tcMar>
+          </w:tcPr>
+          <w:p>
+            <w:pPr>
+              <w:jc w:val="left"/>
+            </w:pPr>
+            <w:r>
+              <w:rPr>
+                <w:rFonts w:ascii="Arial" w:cs="Arial" w:eastAsia="Arial" w:hAnsi="Arial"/>
+                <w:b w:val="false"/>
+                <w:bCs w:val="false"/>
+                <w:sz w:val="22"/>
+                <w:szCs w:val="22"/>
+              </w:rPr>
+              <w:t xml:space="preserve">One LLM call after indexed HSL/AIO retrieval. ~2–4s, bounded token cost via adaptive_aio_cap (200–2000 records).</w:t>
+            </w:r>
+          </w:p>
+        </w:tc>
+      </w:tr>
+      <w:tr>
+        <w:tc>
+          <w:tcPr>
+            <w:tcW w:type="dxa" w:w="2640"/>
+            <w:tcBorders>
+              <w:top w:val="single" w:color="CCCCCC" w:sz="1"/>
+              <w:left w:val="single" w:color="CCCCCC" w:sz="1"/>
+              <w:bottom w:val="single" w:color="CCCCCC" w:sz="1"/>
+              <w:right w:val="single" w:color="CCCCCC" w:sz="1"/>
+            </w:tcBorders>
+            <w:tcMar>
+              <w:top w:type="dxa" w:w="80"/>
+              <w:left w:type="dxa" w:w="120"/>
+              <w:bottom w:type="dxa" w:w="80"/>
+              <w:right w:type="dxa" w:w="120"/>
+            </w:tcMar>
+          </w:tcPr>
+          <w:p>
+            <w:pPr>
+              <w:jc w:val="left"/>
+            </w:pPr>
+            <w:r>
+              <w:rPr>
+                <w:rFonts w:ascii="Arial" w:cs="Arial" w:eastAsia="Arial" w:hAnsi="Arial"/>
+                <w:b w:val="false"/>
+                <w:bCs w:val="false"/>
+                <w:sz w:val="22"/>
+                <w:szCs w:val="22"/>
+              </w:rPr>
+              <w:t xml:space="preserve">Tokens per correct answer (long-run)</w:t>
+            </w:r>
+          </w:p>
+        </w:tc>
+        <w:tc>
+          <w:tcPr>
+            <w:tcW w:type="dxa" w:w="2160"/>
+            <w:tcBorders>
+              <w:top w:val="single" w:color="CCCCCC" w:sz="1"/>
+              <w:left w:val="single" w:color="CCCCCC" w:sz="1"/>
+              <w:bottom w:val="single" w:color="CCCCCC" w:sz="1"/>
+              <w:right w:val="single" w:color="CCCCCC" w:sz="1"/>
+            </w:tcBorders>
+            <w:tcMar>
+              <w:top w:type="dxa" w:w="80"/>
+              <w:left w:type="dxa" w:w="120"/>
+              <w:bottom w:type="dxa" w:w="80"/>
+              <w:right w:type="dxa" w:w="120"/>
+            </w:tcMar>
+          </w:tcPr>
+          <w:p>
+            <w:pPr>
+              <w:jc w:val="left"/>
+            </w:pPr>
+            <w:r>
+              <w:rPr>
+                <w:rFonts w:ascii="Arial" w:cs="Arial" w:eastAsia="Arial" w:hAnsi="Arial"/>
+                <w:b w:val="false"/>
+                <w:bCs w:val="false"/>
+                <w:sz w:val="22"/>
+                <w:szCs w:val="22"/>
+              </w:rPr>
+              <w:t xml:space="preserve">Recall</w:t>
+            </w:r>
+          </w:p>
+        </w:tc>
+        <w:tc>
+          <w:tcPr>
+            <w:tcW w:type="dxa" w:w="4560"/>
+            <w:tcBorders>
+              <w:top w:val="single" w:color="CCCCCC" w:sz="1"/>
+              <w:left w:val="single" w:color="CCCCCC" w:sz="1"/>
+              <w:bottom w:val="single" w:color="CCCCCC" w:sz="1"/>
+              <w:right w:val="single" w:color="CCCCCC" w:sz="1"/>
+            </w:tcBorders>
+            <w:tcMar>
+              <w:top w:type="dxa" w:w="80"/>
+              <w:left w:type="dxa" w:w="120"/>
+              <w:bottom w:type="dxa" w:w="80"/>
+              <w:right w:type="dxa" w:w="120"/>
+            </w:tcMar>
+          </w:tcPr>
+          <w:p>
+            <w:pPr>
+              <w:jc w:val="left"/>
+            </w:pPr>
+            <w:r>
+              <w:rPr>
+                <w:rFonts w:ascii="Arial" w:cs="Arial" w:eastAsia="Arial" w:hAnsi="Arial"/>
+                <w:b w:val="false"/>
+                <w:bCs w:val="false"/>
+                <w:sz w:val="22"/>
+                <w:szCs w:val="22"/>
+              </w:rPr>
+              <w:t xml:space="preserve">Amortizes synthesis cost across every re-ask. The longer it runs, the cheaper the average query.</w:t>
+            </w:r>
+          </w:p>
+        </w:tc>
+      </w:tr>
+      <w:tr>
+        <w:tc>
+          <w:tcPr>
+            <w:tcW w:type="dxa" w:w="2640"/>
+            <w:tcBorders>
+              <w:top w:val="single" w:color="CCCCCC" w:sz="1"/>
+              <w:left w:val="single" w:color="CCCCCC" w:sz="1"/>
+              <w:bottom w:val="single" w:color="CCCCCC" w:sz="1"/>
+              <w:right w:val="single" w:color="CCCCCC" w:sz="1"/>
+            </w:tcBorders>
+            <w:tcMar>
+              <w:top w:type="dxa" w:w="80"/>
+              <w:left w:type="dxa" w:w="120"/>
+              <w:bottom w:type="dxa" w:w="80"/>
+              <w:right w:type="dxa" w:w="120"/>
+            </w:tcMar>
+          </w:tcPr>
+          <w:p>
+            <w:pPr>
+              <w:jc w:val="left"/>
+            </w:pPr>
+            <w:r>
+              <w:rPr>
+                <w:rFonts w:ascii="Arial" w:cs="Arial" w:eastAsia="Arial" w:hAnsi="Arial"/>
+                <w:b w:val="false"/>
+                <w:bCs w:val="false"/>
+                <w:sz w:val="22"/>
+                <w:szCs w:val="22"/>
+              </w:rPr>
+              <w:t xml:space="preserve">Completeness on enumerations</w:t>
+            </w:r>
+          </w:p>
+        </w:tc>
+        <w:tc>
+          <w:tcPr>
+            <w:tcW w:type="dxa" w:w="2160"/>
+            <w:tcBorders>
+              <w:top w:val="single" w:color="CCCCCC" w:sz="1"/>
+              <w:left w:val="single" w:color="CCCCCC" w:sz="1"/>
+              <w:bottom w:val="single" w:color="CCCCCC" w:sz="1"/>
+              <w:right w:val="single" w:color="CCCCCC" w:sz="1"/>
+            </w:tcBorders>
+            <w:tcMar>
+              <w:top w:type="dxa" w:w="80"/>
+              <w:left w:type="dxa" w:w="120"/>
+              <w:bottom w:type="dxa" w:w="80"/>
+              <w:right w:type="dxa" w:w="120"/>
+            </w:tcMar>
+          </w:tcPr>
+          <w:p>
+            <w:pPr>
+              <w:jc w:val="left"/>
+            </w:pPr>
+            <w:r>
+              <w:rPr>
+                <w:rFonts w:ascii="Arial" w:cs="Arial" w:eastAsia="Arial" w:hAnsi="Arial"/>
+                <w:b w:val="false"/>
+                <w:bCs w:val="false"/>
+                <w:sz w:val="22"/>
+                <w:szCs w:val="22"/>
+              </w:rPr>
+              <w:t xml:space="preserve">Exhaustive Live</w:t>
+            </w:r>
+          </w:p>
+        </w:tc>
+        <w:tc>
+          <w:tcPr>
+            <w:tcW w:type="dxa" w:w="4560"/>
+            <w:tcBorders>
+              <w:top w:val="single" w:color="CCCCCC" w:sz="1"/>
+              <w:left w:val="single" w:color="CCCCCC" w:sz="1"/>
+              <w:bottom w:val="single" w:color="CCCCCC" w:sz="1"/>
+              <w:right w:val="single" w:color="CCCCCC" w:sz="1"/>
+            </w:tcBorders>
+            <w:tcMar>
+              <w:top w:type="dxa" w:w="80"/>
+              <w:left w:type="dxa" w:w="120"/>
+              <w:bottom w:type="dxa" w:w="80"/>
+              <w:right w:type="dxa" w:w="120"/>
+            </w:tcMar>
+          </w:tcPr>
+          <w:p>
+            <w:pPr>
+              <w:jc w:val="left"/>
+            </w:pPr>
+            <w:r>
+              <w:rPr>
+                <w:rFonts w:ascii="Arial" w:cs="Arial" w:eastAsia="Arial" w:hAnsi="Arial"/>
+                <w:b w:val="false"/>
+                <w:bCs w:val="false"/>
+                <w:sz w:val="22"/>
+                <w:szCs w:val="22"/>
+              </w:rPr>
+              <w:t xml:space="preserve">Only mode that guarantees every matching AIO reaches the LLM. Costs ~N × Live tokens (N = ceil(matched_aios / chunk_size)).</w:t>
+            </w:r>
+          </w:p>
+        </w:tc>
+      </w:tr>
+      <w:tr>
+        <w:tc>
+          <w:tcPr>
+            <w:tcW w:type="dxa" w:w="2640"/>
+            <w:tcBorders>
+              <w:top w:val="single" w:color="CCCCCC" w:sz="1"/>
+              <w:left w:val="single" w:color="CCCCCC" w:sz="1"/>
+              <w:bottom w:val="single" w:color="CCCCCC" w:sz="1"/>
+              <w:right w:val="single" w:color="CCCCCC" w:sz="1"/>
+            </w:tcBorders>
+            <w:tcMar>
+              <w:top w:type="dxa" w:w="80"/>
+              <w:left w:type="dxa" w:w="120"/>
+              <w:bottom w:type="dxa" w:w="80"/>
+              <w:right w:type="dxa" w:w="120"/>
+            </w:tcMar>
+          </w:tcPr>
+          <w:p>
+            <w:pPr>
+              <w:jc w:val="left"/>
+            </w:pPr>
+            <w:r>
+              <w:rPr>
+                <w:rFonts w:ascii="Arial" w:cs="Arial" w:eastAsia="Arial" w:hAnsi="Arial"/>
+                <w:b w:val="false"/>
+                <w:bCs w:val="false"/>
+                <w:sz w:val="22"/>
+                <w:szCs w:val="22"/>
+              </w:rPr>
+              <w:t xml:space="preserve">No-substrate baseline</w:t>
+            </w:r>
+          </w:p>
+        </w:tc>
+        <w:tc>
+          <w:tcPr>
+            <w:tcW w:type="dxa" w:w="2160"/>
+            <w:tcBorders>
+              <w:top w:val="single" w:color="CCCCCC" w:sz="1"/>
+              <w:left w:val="single" w:color="CCCCCC" w:sz="1"/>
+              <w:bottom w:val="single" w:color="CCCCCC" w:sz="1"/>
+              <w:right w:val="single" w:color="CCCCCC" w:sz="1"/>
+            </w:tcBorders>
+            <w:tcMar>
+              <w:top w:type="dxa" w:w="80"/>
+              <w:left w:type="dxa" w:w="120"/>
+              <w:bottom w:type="dxa" w:w="80"/>
+              <w:right w:type="dxa" w:w="120"/>
+            </w:tcMar>
+          </w:tcPr>
+          <w:p>
+            <w:pPr>
+              <w:jc w:val="left"/>
+            </w:pPr>
+            <w:r>
+              <w:rPr>
+                <w:rFonts w:ascii="Arial" w:cs="Arial" w:eastAsia="Arial" w:hAnsi="Arial"/>
+                <w:b w:val="false"/>
+                <w:bCs w:val="false"/>
+                <w:sz w:val="22"/>
+                <w:szCs w:val="22"/>
+              </w:rPr>
+              <w:t xml:space="preserve">Raw / Broad</w:t>
+            </w:r>
+          </w:p>
+        </w:tc>
+        <w:tc>
+          <w:tcPr>
+            <w:tcW w:type="dxa" w:w="4560"/>
+            <w:tcBorders>
+              <w:top w:val="single" w:color="CCCCCC" w:sz="1"/>
+              <w:left w:val="single" w:color="CCCCCC" w:sz="1"/>
+              <w:bottom w:val="single" w:color="CCCCCC" w:sz="1"/>
+              <w:right w:val="single" w:color="CCCCCC" w:sz="1"/>
+            </w:tcBorders>
+            <w:tcMar>
+              <w:top w:type="dxa" w:w="80"/>
+              <w:left w:type="dxa" w:w="120"/>
+              <w:bottom w:type="dxa" w:w="80"/>
+              <w:right w:type="dxa" w:w="120"/>
+            </w:tcMar>
+          </w:tcPr>
+          <w:p>
+            <w:pPr>
+              <w:jc w:val="left"/>
+            </w:pPr>
+            <w:r>
+              <w:rPr>
+                <w:rFonts w:ascii="Arial" w:cs="Arial" w:eastAsia="Arial" w:hAnsi="Arial"/>
+                <w:b w:val="false"/>
+                <w:bCs w:val="false"/>
+                <w:sz w:val="22"/>
+                <w:szCs w:val="22"/>
+              </w:rPr>
+              <w:t xml:space="preserve">Don't use these for production answers — they exist for benchmarking what the AIO substrate buys.</w:t>
+            </w:r>
+          </w:p>
+        </w:tc>
+      </w:tr>
+    </w:tbl>
+    <w:p>
+      <w:pPr>
+        <w:pStyle w:val="Heading2"/>
+        <w:spacing w:after="120" w:before="240"/>
+      </w:pPr>
+      <w:r>
+        <w:rPr>
+          <w:rFonts w:ascii="Arial" w:cs="Arial" w:eastAsia="Arial" w:hAnsi="Arial"/>
+          <w:b/>
+          <w:bCs/>
+          <w:sz w:val="28"/>
+          <w:szCs w:val="28"/>
+        </w:rPr>
+        <w:t xml:space="preserve">6.1 Default rule</w:t>
+      </w:r>
+    </w:p>
+    <w:p>
+      <w:pPr>
+        <w:spacing w:after="120"/>
+      </w:pPr>
+      <w:r>
+        <w:t xml:space="preserve">Use Recall. It's the Enter-key default in ChatAIO for a reason:</w:t>
       </w:r>
     </w:p>
     <w:p>
@@ -1347,7 +1981,7 @@
         <w:spacing w:after="60"/>
       </w:pPr>
       <w:r>
-        <w:t xml:space="preserve">Is this an enumeration (“list all”, “how many”, “every”)? → Exhaustive Live.</w:t>
+        <w:t xml:space="preserve">Repeat queries cost zero tokens (MRO cache hit)</w:t>
       </w:r>
     </w:p>
     <w:p>
@@ -1360,7 +1994,7 @@
         <w:spacing w:after="60"/>
       </w:pPr>
       <w:r>
-        <w:t xml:space="preserve">Have you asked this before, or is recurrence likely? → Recall.</w:t>
+        <w:t xml:space="preserve">Fresh queries fall through to the same substrate path Live uses, just memory-augmented</w:t>
       </w:r>
     </w:p>
     <w:p>
@@ -1373,7 +2007,7 @@
         <w:spacing w:after="60"/>
       </w:pPr>
       <w:r>
-        <w:t xml:space="preserve">One-shot single fact, no memory needed? → Live.</w:t>
+        <w:t xml:space="preserve">Each answer persists as a new MRO, so the system gets strictly more efficient over time</w:t>
       </w:r>
     </w:p>
     <w:p>
@@ -1386,7 +2020,23 @@
         <w:spacing w:after="60"/>
       </w:pPr>
       <w:r>
-        <w:t xml:space="preserve">Smoke-testing or demoing the substrate? → Broad.</w:t>
+        <w:t xml:space="preserve">Force fresh / Thorough toggles let you bypass the cache when you need to</w:t>
+      </w:r>
+    </w:p>
+    <w:p>
+      <w:pPr>
+        <w:pStyle w:val="Heading2"/>
+        <w:spacing w:after="120" w:before="240"/>
+      </w:pPr>
+      <w:r>
+        <w:rPr>
+          <w:rFonts w:ascii="Arial" w:cs="Arial" w:eastAsia="Arial" w:hAnsi="Arial"/>
+          <w:b/>
+          <w:bCs/>
+          <w:sz w:val="28"/>
+          <w:szCs w:val="28"/>
+        </w:rPr>
+        <w:t xml:space="preserve">6.2 When to switch off Recall</w:t>
       </w:r>
     </w:p>
     <w:p>
@@ -1399,9 +2049,1215 @@
         <w:spacing w:after="60"/>
       </w:pPr>
       <w:r>
-        <w:t xml:space="preserve">Comparing against “what would Claude do without our substrate?” → Raw.</w:t>
-      </w:r>
-    </w:p>
+        <w:t xml:space="preserve">"List all X" / "How many Y" / "Find every Z" → Exhaustive Live (V5.0). Recall and Live can both silently truncate via diversify_by_csv + LLM filter drift; Exhaustive guarantees full coverage at the cost of N chunked LLM calls.</w:t>
+      </w:r>
+    </w:p>
+    <w:p>
+      <w:pPr>
+        <w:pStyle w:val="ListParagraph"/>
+        <w:numPr>
+          <w:ilvl w:val="0"/>
+          <w:numId w:val="2"/>
+        </w:numPr>
+        <w:spacing w:after="60"/>
+      </w:pPr>
+      <w:r>
+        <w:t xml:space="preserve">"Is the corpus connected to the LLM at all?" → Live with bypassCache. Single fresh round-trip with no MRO interference.</w:t>
+      </w:r>
+    </w:p>
+    <w:p>
+      <w:pPr>
+        <w:pStyle w:val="ListParagraph"/>
+        <w:numPr>
+          <w:ilvl w:val="0"/>
+          <w:numId w:val="2"/>
+        </w:numPr>
+        <w:spacing w:after="60"/>
+      </w:pPr>
+      <w:r>
+        <w:t xml:space="preserve">Benchmarking the substrate itself → Run Compare-Modes (Recall + Live + Pure-LLM side-by-side). Available in R&amp;D.</w:t>
+      </w:r>
+    </w:p>
+    <w:p>
+      <w:pPr>
+        <w:pStyle w:val="Heading2"/>
+        <w:spacing w:after="120" w:before="240"/>
+      </w:pPr>
+      <w:r>
+        <w:rPr>
+          <w:rFonts w:ascii="Arial" w:cs="Arial" w:eastAsia="Arial" w:hAnsi="Arial"/>
+          <w:b/>
+          <w:bCs/>
+          <w:sz w:val="28"/>
+          <w:szCs w:val="28"/>
+        </w:rPr>
+        <w:t xml:space="preserve">6.3 Latency / cost summary</w:t>
+      </w:r>
+    </w:p>
+    <w:tbl>
+      <w:tblPr>
+        <w:tblW w:type="dxa" w:w="9360"/>
+        <w:tblBorders>
+          <w:top w:val="single" w:color="auto" w:sz="4"/>
+          <w:left w:val="single" w:color="auto" w:sz="4"/>
+          <w:bottom w:val="single" w:color="auto" w:sz="4"/>
+          <w:right w:val="single" w:color="auto" w:sz="4"/>
+          <w:insideH w:val="single" w:color="auto" w:sz="4"/>
+          <w:insideV w:val="single" w:color="auto" w:sz="4"/>
+        </w:tblBorders>
+      </w:tblPr>
+      <w:tblGrid>
+        <w:gridCol w:w="1900"/>
+        <w:gridCol w:w="1100"/>
+        <w:gridCol w:w="2200"/>
+        <w:gridCol w:w="2400"/>
+        <w:gridCol w:w="1760"/>
+      </w:tblGrid>
+      <w:tr>
+        <w:tc>
+          <w:tcPr>
+            <w:tcW w:type="dxa" w:w="1900"/>
+            <w:tcBorders>
+              <w:top w:val="single" w:color="CCCCCC" w:sz="1"/>
+              <w:left w:val="single" w:color="CCCCCC" w:sz="1"/>
+              <w:bottom w:val="single" w:color="CCCCCC" w:sz="1"/>
+              <w:right w:val="single" w:color="CCCCCC" w:sz="1"/>
+            </w:tcBorders>
+            <w:shd w:fill="0F3460" w:val="clear"/>
+            <w:tcMar>
+              <w:top w:type="dxa" w:w="80"/>
+              <w:left w:type="dxa" w:w="120"/>
+              <w:bottom w:type="dxa" w:w="80"/>
+              <w:right w:type="dxa" w:w="120"/>
+            </w:tcMar>
+          </w:tcPr>
+          <w:p>
+            <w:pPr>
+              <w:jc w:val="left"/>
+            </w:pPr>
+            <w:r>
+              <w:rPr>
+                <w:rFonts w:ascii="Arial" w:cs="Arial" w:eastAsia="Arial" w:hAnsi="Arial"/>
+                <w:b/>
+                <w:bCs/>
+                <w:color w:val="FFFFFF"/>
+                <w:sz w:val="22"/>
+                <w:szCs w:val="22"/>
+              </w:rPr>
+              <w:t xml:space="preserve">Mode</w:t>
+            </w:r>
+          </w:p>
+        </w:tc>
+        <w:tc>
+          <w:tcPr>
+            <w:tcW w:type="dxa" w:w="1100"/>
+            <w:tcBorders>
+              <w:top w:val="single" w:color="CCCCCC" w:sz="1"/>
+              <w:left w:val="single" w:color="CCCCCC" w:sz="1"/>
+              <w:bottom w:val="single" w:color="CCCCCC" w:sz="1"/>
+              <w:right w:val="single" w:color="CCCCCC" w:sz="1"/>
+            </w:tcBorders>
+            <w:shd w:fill="0F3460" w:val="clear"/>
+            <w:tcMar>
+              <w:top w:type="dxa" w:w="80"/>
+              <w:left w:type="dxa" w:w="120"/>
+              <w:bottom w:type="dxa" w:w="80"/>
+              <w:right w:type="dxa" w:w="120"/>
+            </w:tcMar>
+          </w:tcPr>
+          <w:p>
+            <w:pPr>
+              <w:jc w:val="left"/>
+            </w:pPr>
+            <w:r>
+              <w:rPr>
+                <w:rFonts w:ascii="Arial" w:cs="Arial" w:eastAsia="Arial" w:hAnsi="Arial"/>
+                <w:b/>
+                <w:bCs/>
+                <w:color w:val="FFFFFF"/>
+                <w:sz w:val="22"/>
+                <w:szCs w:val="22"/>
+              </w:rPr>
+              <w:t xml:space="preserve">Cache hit</w:t>
+            </w:r>
+          </w:p>
+        </w:tc>
+        <w:tc>
+          <w:tcPr>
+            <w:tcW w:type="dxa" w:w="2200"/>
+            <w:tcBorders>
+              <w:top w:val="single" w:color="CCCCCC" w:sz="1"/>
+              <w:left w:val="single" w:color="CCCCCC" w:sz="1"/>
+              <w:bottom w:val="single" w:color="CCCCCC" w:sz="1"/>
+              <w:right w:val="single" w:color="CCCCCC" w:sz="1"/>
+            </w:tcBorders>
+            <w:shd w:fill="0F3460" w:val="clear"/>
+            <w:tcMar>
+              <w:top w:type="dxa" w:w="80"/>
+              <w:left w:type="dxa" w:w="120"/>
+              <w:bottom w:type="dxa" w:w="80"/>
+              <w:right w:type="dxa" w:w="120"/>
+            </w:tcMar>
+          </w:tcPr>
+          <w:p>
+            <w:pPr>
+              <w:jc w:val="left"/>
+            </w:pPr>
+            <w:r>
+              <w:rPr>
+                <w:rFonts w:ascii="Arial" w:cs="Arial" w:eastAsia="Arial" w:hAnsi="Arial"/>
+                <w:b/>
+                <w:bCs/>
+                <w:color w:val="FFFFFF"/>
+                <w:sz w:val="22"/>
+                <w:szCs w:val="22"/>
+              </w:rPr>
+              <w:t xml:space="preserve">Fresh fast path</w:t>
+            </w:r>
+          </w:p>
+        </w:tc>
+        <w:tc>
+          <w:tcPr>
+            <w:tcW w:type="dxa" w:w="2400"/>
+            <w:tcBorders>
+              <w:top w:val="single" w:color="CCCCCC" w:sz="1"/>
+              <w:left w:val="single" w:color="CCCCCC" w:sz="1"/>
+              <w:bottom w:val="single" w:color="CCCCCC" w:sz="1"/>
+              <w:right w:val="single" w:color="CCCCCC" w:sz="1"/>
+            </w:tcBorders>
+            <w:shd w:fill="0F3460" w:val="clear"/>
+            <w:tcMar>
+              <w:top w:type="dxa" w:w="80"/>
+              <w:left w:type="dxa" w:w="120"/>
+              <w:bottom w:type="dxa" w:w="80"/>
+              <w:right w:type="dxa" w:w="120"/>
+            </w:tcMar>
+          </w:tcPr>
+          <w:p>
+            <w:pPr>
+              <w:jc w:val="left"/>
+            </w:pPr>
+            <w:r>
+              <w:rPr>
+                <w:rFonts w:ascii="Arial" w:cs="Arial" w:eastAsia="Arial" w:hAnsi="Arial"/>
+                <w:b/>
+                <w:bCs/>
+                <w:color w:val="FFFFFF"/>
+                <w:sz w:val="22"/>
+                <w:szCs w:val="22"/>
+              </w:rPr>
+              <w:t xml:space="preserve">Tokens / call</w:t>
+            </w:r>
+          </w:p>
+        </w:tc>
+        <w:tc>
+          <w:tcPr>
+            <w:tcW w:type="dxa" w:w="1760"/>
+            <w:tcBorders>
+              <w:top w:val="single" w:color="CCCCCC" w:sz="1"/>
+              <w:left w:val="single" w:color="CCCCCC" w:sz="1"/>
+              <w:bottom w:val="single" w:color="CCCCCC" w:sz="1"/>
+              <w:right w:val="single" w:color="CCCCCC" w:sz="1"/>
+            </w:tcBorders>
+            <w:shd w:fill="0F3460" w:val="clear"/>
+            <w:tcMar>
+              <w:top w:type="dxa" w:w="80"/>
+              <w:left w:type="dxa" w:w="120"/>
+              <w:bottom w:type="dxa" w:w="80"/>
+              <w:right w:type="dxa" w:w="120"/>
+            </w:tcMar>
+          </w:tcPr>
+          <w:p>
+            <w:pPr>
+              <w:jc w:val="left"/>
+            </w:pPr>
+            <w:r>
+              <w:rPr>
+                <w:rFonts w:ascii="Arial" w:cs="Arial" w:eastAsia="Arial" w:hAnsi="Arial"/>
+                <w:b/>
+                <w:bCs/>
+                <w:color w:val="FFFFFF"/>
+                <w:sz w:val="22"/>
+                <w:szCs w:val="22"/>
+              </w:rPr>
+              <w:t xml:space="preserve">Best for</w:t>
+            </w:r>
+          </w:p>
+        </w:tc>
+      </w:tr>
+      <w:tr>
+        <w:tc>
+          <w:tcPr>
+            <w:tcW w:type="dxa" w:w="1900"/>
+            <w:tcBorders>
+              <w:top w:val="single" w:color="CCCCCC" w:sz="1"/>
+              <w:left w:val="single" w:color="CCCCCC" w:sz="1"/>
+              <w:bottom w:val="single" w:color="CCCCCC" w:sz="1"/>
+              <w:right w:val="single" w:color="CCCCCC" w:sz="1"/>
+            </w:tcBorders>
+            <w:tcMar>
+              <w:top w:type="dxa" w:w="80"/>
+              <w:left w:type="dxa" w:w="120"/>
+              <w:bottom w:type="dxa" w:w="80"/>
+              <w:right w:type="dxa" w:w="120"/>
+            </w:tcMar>
+          </w:tcPr>
+          <w:p>
+            <w:pPr>
+              <w:jc w:val="left"/>
+            </w:pPr>
+            <w:r>
+              <w:rPr>
+                <w:rFonts w:ascii="Arial" w:cs="Arial" w:eastAsia="Arial" w:hAnsi="Arial"/>
+                <w:b w:val="false"/>
+                <w:bCs w:val="false"/>
+                <w:sz w:val="22"/>
+                <w:szCs w:val="22"/>
+              </w:rPr>
+              <w:t xml:space="preserve">Recall (cache hit)</w:t>
+            </w:r>
+          </w:p>
+        </w:tc>
+        <w:tc>
+          <w:tcPr>
+            <w:tcW w:type="dxa" w:w="1100"/>
+            <w:tcBorders>
+              <w:top w:val="single" w:color="CCCCCC" w:sz="1"/>
+              <w:left w:val="single" w:color="CCCCCC" w:sz="1"/>
+              <w:bottom w:val="single" w:color="CCCCCC" w:sz="1"/>
+              <w:right w:val="single" w:color="CCCCCC" w:sz="1"/>
+            </w:tcBorders>
+            <w:tcMar>
+              <w:top w:type="dxa" w:w="80"/>
+              <w:left w:type="dxa" w:w="120"/>
+              <w:bottom w:type="dxa" w:w="80"/>
+              <w:right w:type="dxa" w:w="120"/>
+            </w:tcMar>
+          </w:tcPr>
+          <w:p>
+            <w:pPr>
+              <w:jc w:val="left"/>
+            </w:pPr>
+            <w:r>
+              <w:rPr>
+                <w:rFonts w:ascii="Arial" w:cs="Arial" w:eastAsia="Arial" w:hAnsi="Arial"/>
+                <w:b w:val="false"/>
+                <w:bCs w:val="false"/>
+                <w:sz w:val="22"/>
+                <w:szCs w:val="22"/>
+              </w:rPr>
+              <w:t xml:space="preserve">~50 ms</w:t>
+            </w:r>
+          </w:p>
+        </w:tc>
+        <w:tc>
+          <w:tcPr>
+            <w:tcW w:type="dxa" w:w="2200"/>
+            <w:tcBorders>
+              <w:top w:val="single" w:color="CCCCCC" w:sz="1"/>
+              <w:left w:val="single" w:color="CCCCCC" w:sz="1"/>
+              <w:bottom w:val="single" w:color="CCCCCC" w:sz="1"/>
+              <w:right w:val="single" w:color="CCCCCC" w:sz="1"/>
+            </w:tcBorders>
+            <w:tcMar>
+              <w:top w:type="dxa" w:w="80"/>
+              <w:left w:type="dxa" w:w="120"/>
+              <w:bottom w:type="dxa" w:w="80"/>
+              <w:right w:type="dxa" w:w="120"/>
+            </w:tcMar>
+          </w:tcPr>
+          <w:p>
+            <w:pPr>
+              <w:jc w:val="left"/>
+            </w:pPr>
+            <w:r>
+              <w:rPr>
+                <w:rFonts w:ascii="Arial" w:cs="Arial" w:eastAsia="Arial" w:hAnsi="Arial"/>
+                <w:b w:val="false"/>
+                <w:bCs w:val="false"/>
+                <w:sz w:val="22"/>
+                <w:szCs w:val="22"/>
+              </w:rPr>
+              <w:t xml:space="preserve">—</w:t>
+            </w:r>
+          </w:p>
+        </w:tc>
+        <w:tc>
+          <w:tcPr>
+            <w:tcW w:type="dxa" w:w="2400"/>
+            <w:tcBorders>
+              <w:top w:val="single" w:color="CCCCCC" w:sz="1"/>
+              <w:left w:val="single" w:color="CCCCCC" w:sz="1"/>
+              <w:bottom w:val="single" w:color="CCCCCC" w:sz="1"/>
+              <w:right w:val="single" w:color="CCCCCC" w:sz="1"/>
+            </w:tcBorders>
+            <w:tcMar>
+              <w:top w:type="dxa" w:w="80"/>
+              <w:left w:type="dxa" w:w="120"/>
+              <w:bottom w:type="dxa" w:w="80"/>
+              <w:right w:type="dxa" w:w="120"/>
+            </w:tcMar>
+          </w:tcPr>
+          <w:p>
+            <w:pPr>
+              <w:jc w:val="left"/>
+            </w:pPr>
+            <w:r>
+              <w:rPr>
+                <w:rFonts w:ascii="Arial" w:cs="Arial" w:eastAsia="Arial" w:hAnsi="Arial"/>
+                <w:b w:val="false"/>
+                <w:bCs w:val="false"/>
+                <w:sz w:val="22"/>
+                <w:szCs w:val="22"/>
+              </w:rPr>
+              <w:t xml:space="preserve">0</w:t>
+            </w:r>
+          </w:p>
+        </w:tc>
+        <w:tc>
+          <w:tcPr>
+            <w:tcW w:type="dxa" w:w="1760"/>
+            <w:tcBorders>
+              <w:top w:val="single" w:color="CCCCCC" w:sz="1"/>
+              <w:left w:val="single" w:color="CCCCCC" w:sz="1"/>
+              <w:bottom w:val="single" w:color="CCCCCC" w:sz="1"/>
+              <w:right w:val="single" w:color="CCCCCC" w:sz="1"/>
+            </w:tcBorders>
+            <w:tcMar>
+              <w:top w:type="dxa" w:w="80"/>
+              <w:left w:type="dxa" w:w="120"/>
+              <w:bottom w:type="dxa" w:w="80"/>
+              <w:right w:type="dxa" w:w="120"/>
+            </w:tcMar>
+          </w:tcPr>
+          <w:p>
+            <w:pPr>
+              <w:jc w:val="left"/>
+            </w:pPr>
+            <w:r>
+              <w:rPr>
+                <w:rFonts w:ascii="Arial" w:cs="Arial" w:eastAsia="Arial" w:hAnsi="Arial"/>
+                <w:b w:val="false"/>
+                <w:bCs w:val="false"/>
+                <w:sz w:val="22"/>
+                <w:szCs w:val="22"/>
+              </w:rPr>
+              <w:t xml:space="preserve">Repeat queries</w:t>
+            </w:r>
+          </w:p>
+        </w:tc>
+      </w:tr>
+      <w:tr>
+        <w:tc>
+          <w:tcPr>
+            <w:tcW w:type="dxa" w:w="1900"/>
+            <w:tcBorders>
+              <w:top w:val="single" w:color="CCCCCC" w:sz="1"/>
+              <w:left w:val="single" w:color="CCCCCC" w:sz="1"/>
+              <w:bottom w:val="single" w:color="CCCCCC" w:sz="1"/>
+              <w:right w:val="single" w:color="CCCCCC" w:sz="1"/>
+            </w:tcBorders>
+            <w:tcMar>
+              <w:top w:type="dxa" w:w="80"/>
+              <w:left w:type="dxa" w:w="120"/>
+              <w:bottom w:type="dxa" w:w="80"/>
+              <w:right w:type="dxa" w:w="120"/>
+            </w:tcMar>
+          </w:tcPr>
+          <w:p>
+            <w:pPr>
+              <w:jc w:val="left"/>
+            </w:pPr>
+            <w:r>
+              <w:rPr>
+                <w:rFonts w:ascii="Arial" w:cs="Arial" w:eastAsia="Arial" w:hAnsi="Arial"/>
+                <w:b w:val="false"/>
+                <w:bCs w:val="false"/>
+                <w:sz w:val="22"/>
+                <w:szCs w:val="22"/>
+              </w:rPr>
+              <w:t xml:space="preserve">Recall (cache miss)</w:t>
+            </w:r>
+          </w:p>
+        </w:tc>
+        <w:tc>
+          <w:tcPr>
+            <w:tcW w:type="dxa" w:w="1100"/>
+            <w:tcBorders>
+              <w:top w:val="single" w:color="CCCCCC" w:sz="1"/>
+              <w:left w:val="single" w:color="CCCCCC" w:sz="1"/>
+              <w:bottom w:val="single" w:color="CCCCCC" w:sz="1"/>
+              <w:right w:val="single" w:color="CCCCCC" w:sz="1"/>
+            </w:tcBorders>
+            <w:tcMar>
+              <w:top w:type="dxa" w:w="80"/>
+              <w:left w:type="dxa" w:w="120"/>
+              <w:bottom w:type="dxa" w:w="80"/>
+              <w:right w:type="dxa" w:w="120"/>
+            </w:tcMar>
+          </w:tcPr>
+          <w:p>
+            <w:pPr>
+              <w:jc w:val="left"/>
+            </w:pPr>
+            <w:r>
+              <w:rPr>
+                <w:rFonts w:ascii="Arial" w:cs="Arial" w:eastAsia="Arial" w:hAnsi="Arial"/>
+                <w:b w:val="false"/>
+                <w:bCs w:val="false"/>
+                <w:sz w:val="22"/>
+                <w:szCs w:val="22"/>
+              </w:rPr>
+              <w:t xml:space="preserve">—</w:t>
+            </w:r>
+          </w:p>
+        </w:tc>
+        <w:tc>
+          <w:tcPr>
+            <w:tcW w:type="dxa" w:w="2200"/>
+            <w:tcBorders>
+              <w:top w:val="single" w:color="CCCCCC" w:sz="1"/>
+              <w:left w:val="single" w:color="CCCCCC" w:sz="1"/>
+              <w:bottom w:val="single" w:color="CCCCCC" w:sz="1"/>
+              <w:right w:val="single" w:color="CCCCCC" w:sz="1"/>
+            </w:tcBorders>
+            <w:tcMar>
+              <w:top w:type="dxa" w:w="80"/>
+              <w:left w:type="dxa" w:w="120"/>
+              <w:bottom w:type="dxa" w:w="80"/>
+              <w:right w:type="dxa" w:w="120"/>
+            </w:tcMar>
+          </w:tcPr>
+          <w:p>
+            <w:pPr>
+              <w:jc w:val="left"/>
+            </w:pPr>
+            <w:r>
+              <w:rPr>
+                <w:rFonts w:ascii="Arial" w:cs="Arial" w:eastAsia="Arial" w:hAnsi="Arial"/>
+                <w:b w:val="false"/>
+                <w:bCs w:val="false"/>
+                <w:sz w:val="22"/>
+                <w:szCs w:val="22"/>
+              </w:rPr>
+              <w:t xml:space="preserve">~2–4 s</w:t>
+            </w:r>
+          </w:p>
+        </w:tc>
+        <w:tc>
+          <w:tcPr>
+            <w:tcW w:type="dxa" w:w="2400"/>
+            <w:tcBorders>
+              <w:top w:val="single" w:color="CCCCCC" w:sz="1"/>
+              <w:left w:val="single" w:color="CCCCCC" w:sz="1"/>
+              <w:bottom w:val="single" w:color="CCCCCC" w:sz="1"/>
+              <w:right w:val="single" w:color="CCCCCC" w:sz="1"/>
+            </w:tcBorders>
+            <w:tcMar>
+              <w:top w:type="dxa" w:w="80"/>
+              <w:left w:type="dxa" w:w="120"/>
+              <w:bottom w:type="dxa" w:w="80"/>
+              <w:right w:type="dxa" w:w="120"/>
+            </w:tcMar>
+          </w:tcPr>
+          <w:p>
+            <w:pPr>
+              <w:jc w:val="left"/>
+            </w:pPr>
+            <w:r>
+              <w:rPr>
+                <w:rFonts w:ascii="Arial" w:cs="Arial" w:eastAsia="Arial" w:hAnsi="Arial"/>
+                <w:b w:val="false"/>
+                <w:bCs w:val="false"/>
+                <w:sz w:val="22"/>
+                <w:szCs w:val="22"/>
+              </w:rPr>
+              <w:t xml:space="preserve">Live + priors</w:t>
+            </w:r>
+          </w:p>
+        </w:tc>
+        <w:tc>
+          <w:tcPr>
+            <w:tcW w:type="dxa" w:w="1760"/>
+            <w:tcBorders>
+              <w:top w:val="single" w:color="CCCCCC" w:sz="1"/>
+              <w:left w:val="single" w:color="CCCCCC" w:sz="1"/>
+              <w:bottom w:val="single" w:color="CCCCCC" w:sz="1"/>
+              <w:right w:val="single" w:color="CCCCCC" w:sz="1"/>
+            </w:tcBorders>
+            <w:tcMar>
+              <w:top w:type="dxa" w:w="80"/>
+              <w:left w:type="dxa" w:w="120"/>
+              <w:bottom w:type="dxa" w:w="80"/>
+              <w:right w:type="dxa" w:w="120"/>
+            </w:tcMar>
+          </w:tcPr>
+          <w:p>
+            <w:pPr>
+              <w:jc w:val="left"/>
+            </w:pPr>
+            <w:r>
+              <w:rPr>
+                <w:rFonts w:ascii="Arial" w:cs="Arial" w:eastAsia="Arial" w:hAnsi="Arial"/>
+                <w:b w:val="false"/>
+                <w:bCs w:val="false"/>
+                <w:sz w:val="22"/>
+                <w:szCs w:val="22"/>
+              </w:rPr>
+              <w:t xml:space="preserve">Personalized search</w:t>
+            </w:r>
+          </w:p>
+        </w:tc>
+      </w:tr>
+      <w:tr>
+        <w:tc>
+          <w:tcPr>
+            <w:tcW w:type="dxa" w:w="1900"/>
+            <w:tcBorders>
+              <w:top w:val="single" w:color="CCCCCC" w:sz="1"/>
+              <w:left w:val="single" w:color="CCCCCC" w:sz="1"/>
+              <w:bottom w:val="single" w:color="CCCCCC" w:sz="1"/>
+              <w:right w:val="single" w:color="CCCCCC" w:sz="1"/>
+            </w:tcBorders>
+            <w:tcMar>
+              <w:top w:type="dxa" w:w="80"/>
+              <w:left w:type="dxa" w:w="120"/>
+              <w:bottom w:type="dxa" w:w="80"/>
+              <w:right w:type="dxa" w:w="120"/>
+            </w:tcMar>
+          </w:tcPr>
+          <w:p>
+            <w:pPr>
+              <w:jc w:val="left"/>
+            </w:pPr>
+            <w:r>
+              <w:rPr>
+                <w:rFonts w:ascii="Arial" w:cs="Arial" w:eastAsia="Arial" w:hAnsi="Arial"/>
+                <w:b w:val="false"/>
+                <w:bCs w:val="false"/>
+                <w:sz w:val="22"/>
+                <w:szCs w:val="22"/>
+              </w:rPr>
+              <w:t xml:space="preserve">Live</w:t>
+            </w:r>
+          </w:p>
+        </w:tc>
+        <w:tc>
+          <w:tcPr>
+            <w:tcW w:type="dxa" w:w="1100"/>
+            <w:tcBorders>
+              <w:top w:val="single" w:color="CCCCCC" w:sz="1"/>
+              <w:left w:val="single" w:color="CCCCCC" w:sz="1"/>
+              <w:bottom w:val="single" w:color="CCCCCC" w:sz="1"/>
+              <w:right w:val="single" w:color="CCCCCC" w:sz="1"/>
+            </w:tcBorders>
+            <w:tcMar>
+              <w:top w:type="dxa" w:w="80"/>
+              <w:left w:type="dxa" w:w="120"/>
+              <w:bottom w:type="dxa" w:w="80"/>
+              <w:right w:type="dxa" w:w="120"/>
+            </w:tcMar>
+          </w:tcPr>
+          <w:p>
+            <w:pPr>
+              <w:jc w:val="left"/>
+            </w:pPr>
+            <w:r>
+              <w:rPr>
+                <w:rFonts w:ascii="Arial" w:cs="Arial" w:eastAsia="Arial" w:hAnsi="Arial"/>
+                <w:b w:val="false"/>
+                <w:bCs w:val="false"/>
+                <w:sz w:val="22"/>
+                <w:szCs w:val="22"/>
+              </w:rPr>
+              <w:t xml:space="preserve">~50 ms</w:t>
+            </w:r>
+          </w:p>
+        </w:tc>
+        <w:tc>
+          <w:tcPr>
+            <w:tcW w:type="dxa" w:w="2200"/>
+            <w:tcBorders>
+              <w:top w:val="single" w:color="CCCCCC" w:sz="1"/>
+              <w:left w:val="single" w:color="CCCCCC" w:sz="1"/>
+              <w:bottom w:val="single" w:color="CCCCCC" w:sz="1"/>
+              <w:right w:val="single" w:color="CCCCCC" w:sz="1"/>
+            </w:tcBorders>
+            <w:tcMar>
+              <w:top w:type="dxa" w:w="80"/>
+              <w:left w:type="dxa" w:w="120"/>
+              <w:bottom w:type="dxa" w:w="80"/>
+              <w:right w:type="dxa" w:w="120"/>
+            </w:tcMar>
+          </w:tcPr>
+          <w:p>
+            <w:pPr>
+              <w:jc w:val="left"/>
+            </w:pPr>
+            <w:r>
+              <w:rPr>
+                <w:rFonts w:ascii="Arial" w:cs="Arial" w:eastAsia="Arial" w:hAnsi="Arial"/>
+                <w:b w:val="false"/>
+                <w:bCs w:val="false"/>
+                <w:sz w:val="22"/>
+                <w:szCs w:val="22"/>
+              </w:rPr>
+              <w:t xml:space="preserve">~2–4 s</w:t>
+            </w:r>
+          </w:p>
+        </w:tc>
+        <w:tc>
+          <w:tcPr>
+            <w:tcW w:type="dxa" w:w="2400"/>
+            <w:tcBorders>
+              <w:top w:val="single" w:color="CCCCCC" w:sz="1"/>
+              <w:left w:val="single" w:color="CCCCCC" w:sz="1"/>
+              <w:bottom w:val="single" w:color="CCCCCC" w:sz="1"/>
+              <w:right w:val="single" w:color="CCCCCC" w:sz="1"/>
+            </w:tcBorders>
+            <w:tcMar>
+              <w:top w:type="dxa" w:w="80"/>
+              <w:left w:type="dxa" w:w="120"/>
+              <w:bottom w:type="dxa" w:w="80"/>
+              <w:right w:type="dxa" w:w="120"/>
+            </w:tcMar>
+          </w:tcPr>
+          <w:p>
+            <w:pPr>
+              <w:jc w:val="left"/>
+            </w:pPr>
+            <w:r>
+              <w:rPr>
+                <w:rFonts w:ascii="Arial" w:cs="Arial" w:eastAsia="Arial" w:hAnsi="Arial"/>
+                <w:b w:val="false"/>
+                <w:bCs w:val="false"/>
+                <w:sz w:val="22"/>
+                <w:szCs w:val="22"/>
+              </w:rPr>
+              <w:t xml:space="preserve">Bounded by cap</w:t>
+            </w:r>
+          </w:p>
+        </w:tc>
+        <w:tc>
+          <w:tcPr>
+            <w:tcW w:type="dxa" w:w="1760"/>
+            <w:tcBorders>
+              <w:top w:val="single" w:color="CCCCCC" w:sz="1"/>
+              <w:left w:val="single" w:color="CCCCCC" w:sz="1"/>
+              <w:bottom w:val="single" w:color="CCCCCC" w:sz="1"/>
+              <w:right w:val="single" w:color="CCCCCC" w:sz="1"/>
+            </w:tcBorders>
+            <w:tcMar>
+              <w:top w:type="dxa" w:w="80"/>
+              <w:left w:type="dxa" w:w="120"/>
+              <w:bottom w:type="dxa" w:w="80"/>
+              <w:right w:type="dxa" w:w="120"/>
+            </w:tcMar>
+          </w:tcPr>
+          <w:p>
+            <w:pPr>
+              <w:jc w:val="left"/>
+            </w:pPr>
+            <w:r>
+              <w:rPr>
+                <w:rFonts w:ascii="Arial" w:cs="Arial" w:eastAsia="Arial" w:hAnsi="Arial"/>
+                <w:b w:val="false"/>
+                <w:bCs w:val="false"/>
+                <w:sz w:val="22"/>
+                <w:szCs w:val="22"/>
+              </w:rPr>
+              <w:t xml:space="preserve">Single-fact lookups</w:t>
+            </w:r>
+          </w:p>
+        </w:tc>
+      </w:tr>
+      <w:tr>
+        <w:tc>
+          <w:tcPr>
+            <w:tcW w:type="dxa" w:w="1900"/>
+            <w:tcBorders>
+              <w:top w:val="single" w:color="CCCCCC" w:sz="1"/>
+              <w:left w:val="single" w:color="CCCCCC" w:sz="1"/>
+              <w:bottom w:val="single" w:color="CCCCCC" w:sz="1"/>
+              <w:right w:val="single" w:color="CCCCCC" w:sz="1"/>
+            </w:tcBorders>
+            <w:tcMar>
+              <w:top w:type="dxa" w:w="80"/>
+              <w:left w:type="dxa" w:w="120"/>
+              <w:bottom w:type="dxa" w:w="80"/>
+              <w:right w:type="dxa" w:w="120"/>
+            </w:tcMar>
+          </w:tcPr>
+          <w:p>
+            <w:pPr>
+              <w:jc w:val="left"/>
+            </w:pPr>
+            <w:r>
+              <w:rPr>
+                <w:rFonts w:ascii="Arial" w:cs="Arial" w:eastAsia="Arial" w:hAnsi="Arial"/>
+                <w:b w:val="false"/>
+                <w:bCs w:val="false"/>
+                <w:sz w:val="22"/>
+                <w:szCs w:val="22"/>
+              </w:rPr>
+              <w:t xml:space="preserve">Exhaustive Live</w:t>
+            </w:r>
+          </w:p>
+        </w:tc>
+        <w:tc>
+          <w:tcPr>
+            <w:tcW w:type="dxa" w:w="1100"/>
+            <w:tcBorders>
+              <w:top w:val="single" w:color="CCCCCC" w:sz="1"/>
+              <w:left w:val="single" w:color="CCCCCC" w:sz="1"/>
+              <w:bottom w:val="single" w:color="CCCCCC" w:sz="1"/>
+              <w:right w:val="single" w:color="CCCCCC" w:sz="1"/>
+            </w:tcBorders>
+            <w:tcMar>
+              <w:top w:type="dxa" w:w="80"/>
+              <w:left w:type="dxa" w:w="120"/>
+              <w:bottom w:type="dxa" w:w="80"/>
+              <w:right w:type="dxa" w:w="120"/>
+            </w:tcMar>
+          </w:tcPr>
+          <w:p>
+            <w:pPr>
+              <w:jc w:val="left"/>
+            </w:pPr>
+            <w:r>
+              <w:rPr>
+                <w:rFonts w:ascii="Arial" w:cs="Arial" w:eastAsia="Arial" w:hAnsi="Arial"/>
+                <w:b w:val="false"/>
+                <w:bCs w:val="false"/>
+                <w:sz w:val="22"/>
+                <w:szCs w:val="22"/>
+              </w:rPr>
+              <w:t xml:space="preserve">~50 ms</w:t>
+            </w:r>
+          </w:p>
+        </w:tc>
+        <w:tc>
+          <w:tcPr>
+            <w:tcW w:type="dxa" w:w="2200"/>
+            <w:tcBorders>
+              <w:top w:val="single" w:color="CCCCCC" w:sz="1"/>
+              <w:left w:val="single" w:color="CCCCCC" w:sz="1"/>
+              <w:bottom w:val="single" w:color="CCCCCC" w:sz="1"/>
+              <w:right w:val="single" w:color="CCCCCC" w:sz="1"/>
+            </w:tcBorders>
+            <w:tcMar>
+              <w:top w:type="dxa" w:w="80"/>
+              <w:left w:type="dxa" w:w="120"/>
+              <w:bottom w:type="dxa" w:w="80"/>
+              <w:right w:type="dxa" w:w="120"/>
+            </w:tcMar>
+          </w:tcPr>
+          <w:p>
+            <w:pPr>
+              <w:jc w:val="left"/>
+            </w:pPr>
+            <w:r>
+              <w:rPr>
+                <w:rFonts w:ascii="Arial" w:cs="Arial" w:eastAsia="Arial" w:hAnsi="Arial"/>
+                <w:b w:val="false"/>
+                <w:bCs w:val="false"/>
+                <w:sz w:val="22"/>
+                <w:szCs w:val="22"/>
+              </w:rPr>
+              <w:t xml:space="preserve">~2–4 s × N chunks</w:t>
+            </w:r>
+          </w:p>
+        </w:tc>
+        <w:tc>
+          <w:tcPr>
+            <w:tcW w:type="dxa" w:w="2400"/>
+            <w:tcBorders>
+              <w:top w:val="single" w:color="CCCCCC" w:sz="1"/>
+              <w:left w:val="single" w:color="CCCCCC" w:sz="1"/>
+              <w:bottom w:val="single" w:color="CCCCCC" w:sz="1"/>
+              <w:right w:val="single" w:color="CCCCCC" w:sz="1"/>
+            </w:tcBorders>
+            <w:tcMar>
+              <w:top w:type="dxa" w:w="80"/>
+              <w:left w:type="dxa" w:w="120"/>
+              <w:bottom w:type="dxa" w:w="80"/>
+              <w:right w:type="dxa" w:w="120"/>
+            </w:tcMar>
+          </w:tcPr>
+          <w:p>
+            <w:pPr>
+              <w:jc w:val="left"/>
+            </w:pPr>
+            <w:r>
+              <w:rPr>
+                <w:rFonts w:ascii="Arial" w:cs="Arial" w:eastAsia="Arial" w:hAnsi="Arial"/>
+                <w:b w:val="false"/>
+                <w:bCs w:val="false"/>
+                <w:sz w:val="22"/>
+                <w:szCs w:val="22"/>
+              </w:rPr>
+              <w:t xml:space="preserve">~N × Live</w:t>
+            </w:r>
+          </w:p>
+        </w:tc>
+        <w:tc>
+          <w:tcPr>
+            <w:tcW w:type="dxa" w:w="1760"/>
+            <w:tcBorders>
+              <w:top w:val="single" w:color="CCCCCC" w:sz="1"/>
+              <w:left w:val="single" w:color="CCCCCC" w:sz="1"/>
+              <w:bottom w:val="single" w:color="CCCCCC" w:sz="1"/>
+              <w:right w:val="single" w:color="CCCCCC" w:sz="1"/>
+            </w:tcBorders>
+            <w:tcMar>
+              <w:top w:type="dxa" w:w="80"/>
+              <w:left w:type="dxa" w:w="120"/>
+              <w:bottom w:type="dxa" w:w="80"/>
+              <w:right w:type="dxa" w:w="120"/>
+            </w:tcMar>
+          </w:tcPr>
+          <w:p>
+            <w:pPr>
+              <w:jc w:val="left"/>
+            </w:pPr>
+            <w:r>
+              <w:rPr>
+                <w:rFonts w:ascii="Arial" w:cs="Arial" w:eastAsia="Arial" w:hAnsi="Arial"/>
+                <w:b w:val="false"/>
+                <w:bCs w:val="false"/>
+                <w:sz w:val="22"/>
+                <w:szCs w:val="22"/>
+              </w:rPr>
+              <w:t xml:space="preserve">Enumerations</w:t>
+            </w:r>
+          </w:p>
+        </w:tc>
+      </w:tr>
+      <w:tr>
+        <w:tc>
+          <w:tcPr>
+            <w:tcW w:type="dxa" w:w="1900"/>
+            <w:tcBorders>
+              <w:top w:val="single" w:color="CCCCCC" w:sz="1"/>
+              <w:left w:val="single" w:color="CCCCCC" w:sz="1"/>
+              <w:bottom w:val="single" w:color="CCCCCC" w:sz="1"/>
+              <w:right w:val="single" w:color="CCCCCC" w:sz="1"/>
+            </w:tcBorders>
+            <w:tcMar>
+              <w:top w:type="dxa" w:w="80"/>
+              <w:left w:type="dxa" w:w="120"/>
+              <w:bottom w:type="dxa" w:w="80"/>
+              <w:right w:type="dxa" w:w="120"/>
+            </w:tcMar>
+          </w:tcPr>
+          <w:p>
+            <w:pPr>
+              <w:jc w:val="left"/>
+            </w:pPr>
+            <w:r>
+              <w:rPr>
+                <w:rFonts w:ascii="Arial" w:cs="Arial" w:eastAsia="Arial" w:hAnsi="Arial"/>
+                <w:b w:val="false"/>
+                <w:bCs w:val="false"/>
+                <w:sz w:val="22"/>
+                <w:szCs w:val="22"/>
+              </w:rPr>
+              <w:t xml:space="preserve">Broad</w:t>
+            </w:r>
+          </w:p>
+        </w:tc>
+        <w:tc>
+          <w:tcPr>
+            <w:tcW w:type="dxa" w:w="1100"/>
+            <w:tcBorders>
+              <w:top w:val="single" w:color="CCCCCC" w:sz="1"/>
+              <w:left w:val="single" w:color="CCCCCC" w:sz="1"/>
+              <w:bottom w:val="single" w:color="CCCCCC" w:sz="1"/>
+              <w:right w:val="single" w:color="CCCCCC" w:sz="1"/>
+            </w:tcBorders>
+            <w:tcMar>
+              <w:top w:type="dxa" w:w="80"/>
+              <w:left w:type="dxa" w:w="120"/>
+              <w:bottom w:type="dxa" w:w="80"/>
+              <w:right w:type="dxa" w:w="120"/>
+            </w:tcMar>
+          </w:tcPr>
+          <w:p>
+            <w:pPr>
+              <w:jc w:val="left"/>
+            </w:pPr>
+            <w:r>
+              <w:rPr>
+                <w:rFonts w:ascii="Arial" w:cs="Arial" w:eastAsia="Arial" w:hAnsi="Arial"/>
+                <w:b w:val="false"/>
+                <w:bCs w:val="false"/>
+                <w:sz w:val="22"/>
+                <w:szCs w:val="22"/>
+              </w:rPr>
+              <w:t xml:space="preserve">—</w:t>
+            </w:r>
+          </w:p>
+        </w:tc>
+        <w:tc>
+          <w:tcPr>
+            <w:tcW w:type="dxa" w:w="2200"/>
+            <w:tcBorders>
+              <w:top w:val="single" w:color="CCCCCC" w:sz="1"/>
+              <w:left w:val="single" w:color="CCCCCC" w:sz="1"/>
+              <w:bottom w:val="single" w:color="CCCCCC" w:sz="1"/>
+              <w:right w:val="single" w:color="CCCCCC" w:sz="1"/>
+            </w:tcBorders>
+            <w:tcMar>
+              <w:top w:type="dxa" w:w="80"/>
+              <w:left w:type="dxa" w:w="120"/>
+              <w:bottom w:type="dxa" w:w="80"/>
+              <w:right w:type="dxa" w:w="120"/>
+            </w:tcMar>
+          </w:tcPr>
+          <w:p>
+            <w:pPr>
+              <w:jc w:val="left"/>
+            </w:pPr>
+            <w:r>
+              <w:rPr>
+                <w:rFonts w:ascii="Arial" w:cs="Arial" w:eastAsia="Arial" w:hAnsi="Arial"/>
+                <w:b w:val="false"/>
+                <w:bCs w:val="false"/>
+                <w:sz w:val="22"/>
+                <w:szCs w:val="22"/>
+              </w:rPr>
+              <w:t xml:space="preserve">~6–10 s</w:t>
+            </w:r>
+          </w:p>
+        </w:tc>
+        <w:tc>
+          <w:tcPr>
+            <w:tcW w:type="dxa" w:w="2400"/>
+            <w:tcBorders>
+              <w:top w:val="single" w:color="CCCCCC" w:sz="1"/>
+              <w:left w:val="single" w:color="CCCCCC" w:sz="1"/>
+              <w:bottom w:val="single" w:color="CCCCCC" w:sz="1"/>
+              <w:right w:val="single" w:color="CCCCCC" w:sz="1"/>
+            </w:tcBorders>
+            <w:tcMar>
+              <w:top w:type="dxa" w:w="80"/>
+              <w:left w:type="dxa" w:w="120"/>
+              <w:bottom w:type="dxa" w:w="80"/>
+              <w:right w:type="dxa" w:w="120"/>
+            </w:tcMar>
+          </w:tcPr>
+          <w:p>
+            <w:pPr>
+              <w:jc w:val="left"/>
+            </w:pPr>
+            <w:r>
+              <w:rPr>
+                <w:rFonts w:ascii="Arial" w:cs="Arial" w:eastAsia="Arial" w:hAnsi="Arial"/>
+                <w:b w:val="false"/>
+                <w:bCs w:val="false"/>
+                <w:sz w:val="22"/>
+                <w:szCs w:val="22"/>
+              </w:rPr>
+              <w:t xml:space="preserve">Highest (300 AIOs flat)</w:t>
+            </w:r>
+          </w:p>
+        </w:tc>
+        <w:tc>
+          <w:tcPr>
+            <w:tcW w:type="dxa" w:w="1760"/>
+            <w:tcBorders>
+              <w:top w:val="single" w:color="CCCCCC" w:sz="1"/>
+              <w:left w:val="single" w:color="CCCCCC" w:sz="1"/>
+              <w:bottom w:val="single" w:color="CCCCCC" w:sz="1"/>
+              <w:right w:val="single" w:color="CCCCCC" w:sz="1"/>
+            </w:tcBorders>
+            <w:tcMar>
+              <w:top w:type="dxa" w:w="80"/>
+              <w:left w:type="dxa" w:w="120"/>
+              <w:bottom w:type="dxa" w:w="80"/>
+              <w:right w:type="dxa" w:w="120"/>
+            </w:tcMar>
+          </w:tcPr>
+          <w:p>
+            <w:pPr>
+              <w:jc w:val="left"/>
+            </w:pPr>
+            <w:r>
+              <w:rPr>
+                <w:rFonts w:ascii="Arial" w:cs="Arial" w:eastAsia="Arial" w:hAnsi="Arial"/>
+                <w:b w:val="false"/>
+                <w:bCs w:val="false"/>
+                <w:sz w:val="22"/>
+                <w:szCs w:val="22"/>
+              </w:rPr>
+              <w:t xml:space="preserve">Smoke test only</w:t>
+            </w:r>
+          </w:p>
+        </w:tc>
+      </w:tr>
+      <w:tr>
+        <w:tc>
+          <w:tcPr>
+            <w:tcW w:type="dxa" w:w="1900"/>
+            <w:tcBorders>
+              <w:top w:val="single" w:color="CCCCCC" w:sz="1"/>
+              <w:left w:val="single" w:color="CCCCCC" w:sz="1"/>
+              <w:bottom w:val="single" w:color="CCCCCC" w:sz="1"/>
+              <w:right w:val="single" w:color="CCCCCC" w:sz="1"/>
+            </w:tcBorders>
+            <w:tcMar>
+              <w:top w:type="dxa" w:w="80"/>
+              <w:left w:type="dxa" w:w="120"/>
+              <w:bottom w:type="dxa" w:w="80"/>
+              <w:right w:type="dxa" w:w="120"/>
+            </w:tcMar>
+          </w:tcPr>
+          <w:p>
+            <w:pPr>
+              <w:jc w:val="left"/>
+            </w:pPr>
+            <w:r>
+              <w:rPr>
+                <w:rFonts w:ascii="Arial" w:cs="Arial" w:eastAsia="Arial" w:hAnsi="Arial"/>
+                <w:b w:val="false"/>
+                <w:bCs w:val="false"/>
+                <w:sz w:val="22"/>
+                <w:szCs w:val="22"/>
+              </w:rPr>
+              <w:t xml:space="preserve">Raw</w:t>
+            </w:r>
+          </w:p>
+        </w:tc>
+        <w:tc>
+          <w:tcPr>
+            <w:tcW w:type="dxa" w:w="1100"/>
+            <w:tcBorders>
+              <w:top w:val="single" w:color="CCCCCC" w:sz="1"/>
+              <w:left w:val="single" w:color="CCCCCC" w:sz="1"/>
+              <w:bottom w:val="single" w:color="CCCCCC" w:sz="1"/>
+              <w:right w:val="single" w:color="CCCCCC" w:sz="1"/>
+            </w:tcBorders>
+            <w:tcMar>
+              <w:top w:type="dxa" w:w="80"/>
+              <w:left w:type="dxa" w:w="120"/>
+              <w:bottom w:type="dxa" w:w="80"/>
+              <w:right w:type="dxa" w:w="120"/>
+            </w:tcMar>
+          </w:tcPr>
+          <w:p>
+            <w:pPr>
+              <w:jc w:val="left"/>
+            </w:pPr>
+            <w:r>
+              <w:rPr>
+                <w:rFonts w:ascii="Arial" w:cs="Arial" w:eastAsia="Arial" w:hAnsi="Arial"/>
+                <w:b w:val="false"/>
+                <w:bCs w:val="false"/>
+                <w:sz w:val="22"/>
+                <w:szCs w:val="22"/>
+              </w:rPr>
+              <w:t xml:space="preserve">—</w:t>
+            </w:r>
+          </w:p>
+        </w:tc>
+        <w:tc>
+          <w:tcPr>
+            <w:tcW w:type="dxa" w:w="2200"/>
+            <w:tcBorders>
+              <w:top w:val="single" w:color="CCCCCC" w:sz="1"/>
+              <w:left w:val="single" w:color="CCCCCC" w:sz="1"/>
+              <w:bottom w:val="single" w:color="CCCCCC" w:sz="1"/>
+              <w:right w:val="single" w:color="CCCCCC" w:sz="1"/>
+            </w:tcBorders>
+            <w:tcMar>
+              <w:top w:type="dxa" w:w="80"/>
+              <w:left w:type="dxa" w:w="120"/>
+              <w:bottom w:type="dxa" w:w="80"/>
+              <w:right w:type="dxa" w:w="120"/>
+            </w:tcMar>
+          </w:tcPr>
+          <w:p>
+            <w:pPr>
+              <w:jc w:val="left"/>
+            </w:pPr>
+            <w:r>
+              <w:rPr>
+                <w:rFonts w:ascii="Arial" w:cs="Arial" w:eastAsia="Arial" w:hAnsi="Arial"/>
+                <w:b w:val="false"/>
+                <w:bCs w:val="false"/>
+                <w:sz w:val="22"/>
+                <w:szCs w:val="22"/>
+              </w:rPr>
+              <w:t xml:space="preserve">~3–6 s</w:t>
+            </w:r>
+          </w:p>
+        </w:tc>
+        <w:tc>
+          <w:tcPr>
+            <w:tcW w:type="dxa" w:w="2400"/>
+            <w:tcBorders>
+              <w:top w:val="single" w:color="CCCCCC" w:sz="1"/>
+              <w:left w:val="single" w:color="CCCCCC" w:sz="1"/>
+              <w:bottom w:val="single" w:color="CCCCCC" w:sz="1"/>
+              <w:right w:val="single" w:color="CCCCCC" w:sz="1"/>
+            </w:tcBorders>
+            <w:tcMar>
+              <w:top w:type="dxa" w:w="80"/>
+              <w:left w:type="dxa" w:w="120"/>
+              <w:bottom w:type="dxa" w:w="80"/>
+              <w:right w:type="dxa" w:w="120"/>
+            </w:tcMar>
+          </w:tcPr>
+          <w:p>
+            <w:pPr>
+              <w:jc w:val="left"/>
+            </w:pPr>
+            <w:r>
+              <w:rPr>
+                <w:rFonts w:ascii="Arial" w:cs="Arial" w:eastAsia="Arial" w:hAnsi="Arial"/>
+                <w:b w:val="false"/>
+                <w:bCs w:val="false"/>
+                <w:sz w:val="22"/>
+                <w:szCs w:val="22"/>
+              </w:rPr>
+              <w:t xml:space="preserve">Raw CSV size</w:t>
+            </w:r>
+          </w:p>
+        </w:tc>
+        <w:tc>
+          <w:tcPr>
+            <w:tcW w:type="dxa" w:w="1760"/>
+            <w:tcBorders>
+              <w:top w:val="single" w:color="CCCCCC" w:sz="1"/>
+              <w:left w:val="single" w:color="CCCCCC" w:sz="1"/>
+              <w:bottom w:val="single" w:color="CCCCCC" w:sz="1"/>
+              <w:right w:val="single" w:color="CCCCCC" w:sz="1"/>
+            </w:tcBorders>
+            <w:tcMar>
+              <w:top w:type="dxa" w:w="80"/>
+              <w:left w:type="dxa" w:w="120"/>
+              <w:bottom w:type="dxa" w:w="80"/>
+              <w:right w:type="dxa" w:w="120"/>
+            </w:tcMar>
+          </w:tcPr>
+          <w:p>
+            <w:pPr>
+              <w:jc w:val="left"/>
+            </w:pPr>
+            <w:r>
+              <w:rPr>
+                <w:rFonts w:ascii="Arial" w:cs="Arial" w:eastAsia="Arial" w:hAnsi="Arial"/>
+                <w:b w:val="false"/>
+                <w:bCs w:val="false"/>
+                <w:sz w:val="22"/>
+                <w:szCs w:val="22"/>
+              </w:rPr>
+              <w:t xml:space="preserve">Control case only</w:t>
+            </w:r>
+          </w:p>
+        </w:tc>
+      </w:tr>
+    </w:tbl>
     <w:p>
       <w:pPr>
         <w:pStyle w:val="Heading1"/>
@@ -1416,7 +3272,97 @@
           <w:sz w:val="32"/>
           <w:szCs w:val="32"/>
         </w:rPr>
-        <w:t xml:space="preserve">7. Cache namespaces</w:t>
+        <w:t xml:space="preserve">7. Mode-selection decision tree</w:t>
+      </w:r>
+    </w:p>
+    <w:p>
+      <w:pPr>
+        <w:spacing w:after="120"/>
+      </w:pPr>
+      <w:r>
+        <w:t xml:space="preserve">Start at the top; first matching question wins:</w:t>
+      </w:r>
+    </w:p>
+    <w:p>
+      <w:pPr>
+        <w:pStyle w:val="ListParagraph"/>
+        <w:numPr>
+          <w:ilvl w:val="0"/>
+          <w:numId w:val="2"/>
+        </w:numPr>
+        <w:spacing w:after="60"/>
+      </w:pPr>
+      <w:r>
+        <w:t xml:space="preserve">Is this an enumeration ("list all", "how many", "every")? → Exhaustive Live.</w:t>
+      </w:r>
+    </w:p>
+    <w:p>
+      <w:pPr>
+        <w:pStyle w:val="ListParagraph"/>
+        <w:numPr>
+          <w:ilvl w:val="0"/>
+          <w:numId w:val="2"/>
+        </w:numPr>
+        <w:spacing w:after="60"/>
+      </w:pPr>
+      <w:r>
+        <w:t xml:space="preserve">Have you asked this before, or is recurrence likely? → Recall.</w:t>
+      </w:r>
+    </w:p>
+    <w:p>
+      <w:pPr>
+        <w:pStyle w:val="ListParagraph"/>
+        <w:numPr>
+          <w:ilvl w:val="0"/>
+          <w:numId w:val="2"/>
+        </w:numPr>
+        <w:spacing w:after="60"/>
+      </w:pPr>
+      <w:r>
+        <w:t xml:space="preserve">One-shot single fact, no memory needed? → Live.</w:t>
+      </w:r>
+    </w:p>
+    <w:p>
+      <w:pPr>
+        <w:pStyle w:val="ListParagraph"/>
+        <w:numPr>
+          <w:ilvl w:val="0"/>
+          <w:numId w:val="2"/>
+        </w:numPr>
+        <w:spacing w:after="60"/>
+      </w:pPr>
+      <w:r>
+        <w:t xml:space="preserve">Smoke-testing or demoing the substrate? → Broad.</w:t>
+      </w:r>
+    </w:p>
+    <w:p>
+      <w:pPr>
+        <w:pStyle w:val="ListParagraph"/>
+        <w:numPr>
+          <w:ilvl w:val="0"/>
+          <w:numId w:val="2"/>
+        </w:numPr>
+        <w:spacing w:after="60"/>
+      </w:pPr>
+      <w:r>
+        <w:t xml:space="preserve">Comparing against "what would Claude do without our substrate?" → Raw.</w:t>
+      </w:r>
+    </w:p>
+    <w:p>
+      <w:pPr>
+        <w:pStyle w:val="Heading1"/>
+        <w:spacing w:after="180" w:before="360"/>
+      </w:pPr>
+      <w:r>
+        <w:rPr>
+          <w:rFonts w:ascii="Arial" w:cs="Arial" w:eastAsia="Arial" w:hAnsi="Arial"/>
+          <w:b/>
+          <w:bCs/>
+          <w:color w:val="0F3460"/>
+          <w:sz w:val="32"/>
+          <w:szCs w:val="32"/>
+        </w:rPr>
+        <w:t xml:space="preserve">8. Cache namespaces</w:t>
       </w:r>
     </w:p>
     <w:tbl>
@@ -2045,7 +3991,7 @@
           <w:sz w:val="32"/>
           <w:szCs w:val="32"/>
         </w:rPr>
-        <w:t xml:space="preserve">8. MRO intent strings</w:t>
+        <w:t xml:space="preserve">9. MRO intent strings</w:t>
       </w:r>
     </w:p>
     <w:tbl>

</xml_diff>